<commit_message>
Publish site from ivan-website@529e2ed
</commit_message>
<xml_diff>
--- a/downloads/ivan-mikryukov-cv-en.docx
+++ b/downloads/ivan-mikryukov-cv-en.docx
@@ -2,7 +2,7 @@
 <file path=word/document.xml><?xml version="1.0" encoding="utf-8"?>
 <w:document xmlns:w="http://schemas.openxmlformats.org/wordprocessingml/2006/main" xmlns:m="http://schemas.openxmlformats.org/officeDocument/2006/math" xmlns:r="http://schemas.openxmlformats.org/officeDocument/2006/relationships" xmlns:o="urn:schemas-microsoft-com:office:office" xmlns:v="urn:schemas-microsoft-com:vml" xmlns:w10="urn:schemas-microsoft-com:office:word" xmlns:a="http://schemas.openxmlformats.org/drawingml/2006/main" xmlns:pic="http://schemas.openxmlformats.org/drawingml/2006/picture" xmlns:wp="http://schemas.openxmlformats.org/drawingml/2006/wordprocessingDrawing">
   <w:body>
-    <w:bookmarkStart w:id="22" w:name="ivan-mikryukov"/>
+    <w:bookmarkStart w:id="20" w:name="ivan-mikryukov"/>
     <w:p>
       <w:pPr>
         <w:pStyle w:val="Heading1"/>
@@ -16,7 +16,7 @@
         <w:pStyle w:val="FirstParagraph"/>
       </w:pPr>
       <w:r>
-        <w:t xml:space="preserve">Producer, videographer, editor. Looking for an internship or a job in media production.</w:t>
+        <w:t xml:space="preserve">Producer, videographer, editor</w:t>
       </w:r>
     </w:p>
     <w:p>
@@ -28,7 +28,7 @@
         </w:numPr>
       </w:pPr>
       <w:r>
-        <w:t xml:space="preserve">Moscow</w:t>
+        <w:t xml:space="preserve">Moscow, Russia</w:t>
       </w:r>
     </w:p>
     <w:p>
@@ -53,9 +53,6 @@
           <w:t xml:space="preserve">@mikryuk</w:t>
         </w:r>
       </w:hyperlink>
-      <w:r>
-        <w:t xml:space="preserve">, with the channel «МИКРЮКОВ» and all my work in the profile</w:t>
-      </w:r>
     </w:p>
     <w:p>
       <w:pPr>
@@ -80,13 +77,13 @@
         </w:r>
       </w:hyperlink>
     </w:p>
-    <w:bookmarkStart w:id="11" w:name="about-me"/>
+    <w:bookmarkStart w:id="11" w:name="objective"/>
     <w:p>
       <w:pPr>
         <w:pStyle w:val="Heading2"/>
       </w:pPr>
       <w:r>
-        <w:t xml:space="preserve">About me</w:t>
+        <w:t xml:space="preserve">Objective</w:t>
       </w:r>
     </w:p>
     <w:p>
@@ -94,87 +91,7 @@
         <w:pStyle w:val="FirstParagraph"/>
       </w:pPr>
       <w:r>
-        <w:t xml:space="preserve">Second-year student at Plekhanov Russian University of Economics, Media Communications program, Film and Media Production track. I am developing as a producer, videographer and editor.</w:t>
-      </w:r>
-    </w:p>
-    <w:p>
-      <w:pPr>
-        <w:pStyle w:val="BodyText"/>
-      </w:pPr>
-      <w:r>
-        <w:t xml:space="preserve">I have worked with private clients, athletes, bloggers and commercial projects. I take a project from idea to finished result:</w:t>
-      </w:r>
-    </w:p>
-    <w:p>
-      <w:pPr>
-        <w:pStyle w:val="Compact"/>
-        <w:numPr>
-          <w:ilvl w:val="0"/>
-          <w:numId w:val="1002"/>
-        </w:numPr>
-      </w:pPr>
-      <w:r>
-        <w:t xml:space="preserve">discuss the brief with the client;</w:t>
-      </w:r>
-    </w:p>
-    <w:p>
-      <w:pPr>
-        <w:pStyle w:val="Compact"/>
-        <w:numPr>
-          <w:ilvl w:val="0"/>
-          <w:numId w:val="1002"/>
-        </w:numPr>
-      </w:pPr>
-      <w:r>
-        <w:t xml:space="preserve">develop and agree on the concept;</w:t>
-      </w:r>
-    </w:p>
-    <w:p>
-      <w:pPr>
-        <w:pStyle w:val="Compact"/>
-        <w:numPr>
-          <w:ilvl w:val="0"/>
-          <w:numId w:val="1002"/>
-        </w:numPr>
-      </w:pPr>
-      <w:r>
-        <w:t xml:space="preserve">organize the shoot;</w:t>
-      </w:r>
-    </w:p>
-    <w:p>
-      <w:pPr>
-        <w:pStyle w:val="Compact"/>
-        <w:numPr>
-          <w:ilvl w:val="0"/>
-          <w:numId w:val="1002"/>
-        </w:numPr>
-      </w:pPr>
-      <w:r>
-        <w:t xml:space="preserve">work with the people on camera and the locations;</w:t>
-      </w:r>
-    </w:p>
-    <w:p>
-      <w:pPr>
-        <w:pStyle w:val="Compact"/>
-        <w:numPr>
-          <w:ilvl w:val="0"/>
-          <w:numId w:val="1002"/>
-        </w:numPr>
-      </w:pPr>
-      <w:r>
-        <w:t xml:space="preserve">shoot;</w:t>
-      </w:r>
-    </w:p>
-    <w:p>
-      <w:pPr>
-        <w:pStyle w:val="Compact"/>
-        <w:numPr>
-          <w:ilvl w:val="0"/>
-          <w:numId w:val="1002"/>
-        </w:numPr>
-      </w:pPr>
-      <w:r>
-        <w:t xml:space="preserve">edit and do the post-production.</w:t>
+        <w:t xml:space="preserve">Internship or position in video content production.</w:t>
       </w:r>
     </w:p>
     <w:bookmarkEnd w:id="11"/>
@@ -187,13 +104,13 @@
         <w:t xml:space="preserve">Experience</w:t>
       </w:r>
     </w:p>
-    <w:bookmarkStart w:id="12" w:name="videographer-and-editor-freelance"/>
+    <w:bookmarkStart w:id="12" w:name="videographer-editor-freelance"/>
     <w:p>
       <w:pPr>
         <w:pStyle w:val="Heading3"/>
       </w:pPr>
       <w:r>
-        <w:t xml:space="preserve">Videographer and editor, freelance</w:t>
+        <w:t xml:space="preserve">Videographer / Editor — freelance</w:t>
       </w:r>
     </w:p>
     <w:p>
@@ -201,7 +118,103 @@
         <w:pStyle w:val="FirstParagraph"/>
       </w:pPr>
       <w:r>
-        <w:t xml:space="preserve">2023 — present</w:t>
+        <w:t xml:space="preserve">2023 – present</w:t>
+      </w:r>
+    </w:p>
+    <w:p>
+      <w:pPr>
+        <w:pStyle w:val="BodyText"/>
+      </w:pPr>
+      <w:r>
+        <w:t xml:space="preserve">Filming and editing commercial and original video content for private clients, athletes, bloggers and businesses.</w:t>
+      </w:r>
+    </w:p>
+    <w:p>
+      <w:pPr>
+        <w:pStyle w:val="BodyText"/>
+      </w:pPr>
+      <w:r>
+        <w:t xml:space="preserve">Full project cycle, from idea to finished result:</w:t>
+      </w:r>
+    </w:p>
+    <w:p>
+      <w:pPr>
+        <w:pStyle w:val="Compact"/>
+        <w:numPr>
+          <w:ilvl w:val="0"/>
+          <w:numId w:val="1002"/>
+        </w:numPr>
+      </w:pPr>
+      <w:r>
+        <w:t xml:space="preserve">Understanding the client’s needs</w:t>
+      </w:r>
+    </w:p>
+    <w:p>
+      <w:pPr>
+        <w:pStyle w:val="Compact"/>
+        <w:numPr>
+          <w:ilvl w:val="0"/>
+          <w:numId w:val="1002"/>
+        </w:numPr>
+      </w:pPr>
+      <w:r>
+        <w:t xml:space="preserve">Developing the overall concept</w:t>
+      </w:r>
+    </w:p>
+    <w:p>
+      <w:pPr>
+        <w:pStyle w:val="Compact"/>
+        <w:numPr>
+          <w:ilvl w:val="0"/>
+          <w:numId w:val="1002"/>
+        </w:numPr>
+      </w:pPr>
+      <w:r>
+        <w:t xml:space="preserve">Detailed scriptwriting and storyboarding</w:t>
+      </w:r>
+    </w:p>
+    <w:p>
+      <w:pPr>
+        <w:pStyle w:val="Compact"/>
+        <w:numPr>
+          <w:ilvl w:val="0"/>
+          <w:numId w:val="1002"/>
+        </w:numPr>
+      </w:pPr>
+      <w:r>
+        <w:t xml:space="preserve">Pre-production and shoot organization</w:t>
+      </w:r>
+    </w:p>
+    <w:p>
+      <w:pPr>
+        <w:pStyle w:val="Compact"/>
+        <w:numPr>
+          <w:ilvl w:val="0"/>
+          <w:numId w:val="1002"/>
+        </w:numPr>
+      </w:pPr>
+      <w:r>
+        <w:t xml:space="preserve">Filming</w:t>
+      </w:r>
+    </w:p>
+    <w:p>
+      <w:pPr>
+        <w:pStyle w:val="Compact"/>
+        <w:numPr>
+          <w:ilvl w:val="0"/>
+          <w:numId w:val="1002"/>
+        </w:numPr>
+      </w:pPr>
+      <w:r>
+        <w:t xml:space="preserve">Editing and final post-production</w:t>
+      </w:r>
+    </w:p>
+    <w:p>
+      <w:pPr>
+        <w:pStyle w:val="FirstParagraph"/>
+      </w:pPr>
+      <w:r>
+        <w:t xml:space="preserve">Main areas of work:</w:t>
       </w:r>
     </w:p>
     <w:p>
@@ -213,7 +226,7 @@
         </w:numPr>
       </w:pPr>
       <w:r>
-        <w:t xml:space="preserve">Shooting and editing commercial and personal video content.</w:t>
+        <w:t xml:space="preserve">Weddings</w:t>
       </w:r>
     </w:p>
     <w:p>
@@ -225,7 +238,7 @@
         </w:numPr>
       </w:pPr>
       <w:r>
-        <w:t xml:space="preserve">Working with private clients, athletes, bloggers and local projects.</w:t>
+        <w:t xml:space="preserve">Children’s parties</w:t>
       </w:r>
     </w:p>
     <w:p>
@@ -237,7 +250,7 @@
         </w:numPr>
       </w:pPr>
       <w:r>
-        <w:t xml:space="preserve">Short vertical videos (Reels, Shorts) and long horizontal videos.</w:t>
+        <w:t xml:space="preserve">Corporate events</w:t>
       </w:r>
     </w:p>
     <w:p>
@@ -249,7 +262,7 @@
         </w:numPr>
       </w:pPr>
       <w:r>
-        <w:t xml:space="preserve">The full cycle: client communication, idea development, preparing and organizing the shoot, shooting, editing and final grading.</w:t>
+        <w:t xml:space="preserve">Sports and fitness</w:t>
       </w:r>
     </w:p>
     <w:p>
@@ -261,18 +274,74 @@
         </w:numPr>
       </w:pPr>
       <w:r>
-        <w:t xml:space="preserve">Organizing the shoot on my own and working with the people on camera.</w:t>
+        <w:t xml:space="preserve">Automotive content</w:t>
       </w:r>
     </w:p>
     <w:bookmarkEnd w:id="12"/>
     <w:bookmarkEnd w:id="13"/>
-    <w:bookmarkStart w:id="14" w:name="selected-projects"/>
+    <w:bookmarkStart w:id="15" w:name="education"/>
     <w:p>
       <w:pPr>
         <w:pStyle w:val="Heading2"/>
       </w:pPr>
       <w:r>
-        <w:t xml:space="preserve">Selected projects</w:t>
+        <w:t xml:space="preserve">Education</w:t>
+      </w:r>
+    </w:p>
+    <w:bookmarkStart w:id="14" w:name="Xa9fb5b3ae619b275378b0b935d4cd8c4f2941b5"/>
+    <w:p>
+      <w:pPr>
+        <w:pStyle w:val="Heading3"/>
+      </w:pPr>
+      <w:r>
+        <w:t xml:space="preserve">Plekhanov Russian University of Economics</w:t>
+      </w:r>
+    </w:p>
+    <w:p>
+      <w:pPr>
+        <w:pStyle w:val="FirstParagraph"/>
+      </w:pPr>
+      <w:r>
+        <w:t xml:space="preserve">2025 – 2029</w:t>
+      </w:r>
+    </w:p>
+    <w:p>
+      <w:pPr>
+        <w:pStyle w:val="BodyText"/>
+      </w:pPr>
+      <w:r>
+        <w:t xml:space="preserve">Program: Media Communications.</w:t>
+      </w:r>
+    </w:p>
+    <w:p>
+      <w:pPr>
+        <w:pStyle w:val="BodyText"/>
+      </w:pPr>
+      <w:r>
+        <w:t xml:space="preserve">Track: Film and Media Production.</w:t>
+      </w:r>
+    </w:p>
+    <w:p>
+      <w:pPr>
+        <w:pStyle w:val="BodyText"/>
+      </w:pPr>
+      <w:r>
+        <w:rPr>
+          <w:i/>
+          <w:iCs/>
+        </w:rPr>
+        <w:t xml:space="preserve">Independently studying textbooks on film theory, cinematography, lighting and editing.</w:t>
+      </w:r>
+    </w:p>
+    <w:bookmarkEnd w:id="14"/>
+    <w:bookmarkEnd w:id="15"/>
+    <w:bookmarkStart w:id="16" w:name="skills"/>
+    <w:p>
+      <w:pPr>
+        <w:pStyle w:val="Heading2"/>
+      </w:pPr>
+      <w:r>
+        <w:t xml:space="preserve">Skills</w:t>
       </w:r>
     </w:p>
     <w:p>
@@ -284,7 +353,7 @@
         </w:numPr>
       </w:pPr>
       <w:r>
-        <w:t xml:space="preserve">Vertical videos for Alexandra Deeva, Master of Sport in figure skating.</w:t>
+        <w:t xml:space="preserve">Concept, script and storyboard development</w:t>
       </w:r>
     </w:p>
     <w:p>
@@ -296,7 +365,7 @@
         </w:numPr>
       </w:pPr>
       <w:r>
-        <w:t xml:space="preserve">Fitness content together with a trainer: idea, organizing the shoot, working with the athlete, shooting and editing.</w:t>
+        <w:t xml:space="preserve">Shoot preparation and organization</w:t>
       </w:r>
     </w:p>
     <w:p>
@@ -308,7 +377,7 @@
         </w:numPr>
       </w:pPr>
       <w:r>
-        <w:t xml:space="preserve">Sports content with an equestrian coach.</w:t>
+        <w:t xml:space="preserve">Lighting and gimbal work</w:t>
       </w:r>
     </w:p>
     <w:p>
@@ -320,53 +389,30 @@
         </w:numPr>
       </w:pPr>
       <w:r>
-        <w:t xml:space="preserve">Automotive video content.</w:t>
-      </w:r>
-    </w:p>
-    <w:p>
-      <w:pPr>
-        <w:pStyle w:val="Compact"/>
-        <w:numPr>
-          <w:ilvl w:val="0"/>
-          <w:numId w:val="1004"/>
-        </w:numPr>
-      </w:pPr>
-      <w:r>
-        <w:t xml:space="preserve">Shooting and editing a wedding.</w:t>
-      </w:r>
-    </w:p>
-    <w:p>
-      <w:pPr>
-        <w:pStyle w:val="Compact"/>
-        <w:numPr>
-          <w:ilvl w:val="0"/>
-          <w:numId w:val="1004"/>
-        </w:numPr>
-      </w:pPr>
-      <w:r>
-        <w:t xml:space="preserve">Long custom videos for private clients.</w:t>
-      </w:r>
-    </w:p>
-    <w:p>
-      <w:pPr>
-        <w:pStyle w:val="Compact"/>
-        <w:numPr>
-          <w:ilvl w:val="0"/>
-          <w:numId w:val="1004"/>
-        </w:numPr>
-      </w:pPr>
-      <w:r>
-        <w:t xml:space="preserve">Content for local venues, brands and social media.</w:t>
-      </w:r>
-    </w:p>
-    <w:bookmarkEnd w:id="14"/>
-    <w:bookmarkStart w:id="15" w:name="production-skills"/>
+        <w:t xml:space="preserve">Editing and post-production in</w:t>
+      </w:r>
+      <w:r>
+        <w:t xml:space="preserve"> </w:t>
+      </w:r>
+      <w:r>
+        <w:rPr>
+          <w:b/>
+          <w:bCs/>
+        </w:rPr>
+        <w:t xml:space="preserve">DaVinci Resolve</w:t>
+      </w:r>
+      <w:r>
+        <w:t xml:space="preserve">: masking and chroma key, color grading, sound</w:t>
+      </w:r>
+    </w:p>
+    <w:bookmarkEnd w:id="16"/>
+    <w:bookmarkStart w:id="17" w:name="equipment"/>
     <w:p>
       <w:pPr>
         <w:pStyle w:val="Heading2"/>
       </w:pPr>
       <w:r>
-        <w:t xml:space="preserve">Production skills</w:t>
+        <w:t xml:space="preserve">Equipment</w:t>
       </w:r>
     </w:p>
     <w:p>
@@ -378,7 +424,7 @@
         </w:numPr>
       </w:pPr>
       <w:r>
-        <w:t xml:space="preserve">Developing a project concept</w:t>
+        <w:t xml:space="preserve">Camera: Sony ZV-E10 II</w:t>
       </w:r>
     </w:p>
     <w:p>
@@ -390,7 +436,7 @@
         </w:numPr>
       </w:pPr>
       <w:r>
-        <w:t xml:space="preserve">Finding people to film and communicating with clients</w:t>
+        <w:t xml:space="preserve">Lens: Sigma 18–50mm f/2.8</w:t>
       </w:r>
     </w:p>
     <w:p>
@@ -402,7 +448,7 @@
         </w:numPr>
       </w:pPr>
       <w:r>
-        <w:t xml:space="preserve">Preparing and organizing shoots, working with locations</w:t>
+        <w:t xml:space="preserve">Gimbal: DJI RS 4 Mini</w:t>
       </w:r>
     </w:p>
     <w:p>
@@ -414,7 +460,7 @@
         </w:numPr>
       </w:pPr>
       <w:r>
-        <w:t xml:space="preserve">Planning the shoot and its schedule</w:t>
+        <w:t xml:space="preserve">Microphones: DJI Mic mini 2/3</w:t>
       </w:r>
     </w:p>
     <w:p>
@@ -426,29 +472,17 @@
         </w:numPr>
       </w:pPr>
       <w:r>
-        <w:t xml:space="preserve">Coordinating the crew and cast and solving logistics on set</w:t>
-      </w:r>
-    </w:p>
-    <w:p>
-      <w:pPr>
-        <w:pStyle w:val="Compact"/>
-        <w:numPr>
-          <w:ilvl w:val="0"/>
-          <w:numId w:val="1005"/>
-        </w:numPr>
-      </w:pPr>
-      <w:r>
-        <w:t xml:space="preserve">Taking a project from idea to finished result</w:t>
-      </w:r>
-    </w:p>
-    <w:bookmarkEnd w:id="15"/>
-    <w:bookmarkStart w:id="16" w:name="shooting-and-editing"/>
+        <w:t xml:space="preserve">Monitor: Feelworld F 5 Pro X</w:t>
+      </w:r>
+    </w:p>
+    <w:bookmarkEnd w:id="17"/>
+    <w:bookmarkStart w:id="18" w:name="sports"/>
     <w:p>
       <w:pPr>
         <w:pStyle w:val="Heading2"/>
       </w:pPr>
       <w:r>
-        <w:t xml:space="preserve">Shooting and editing</w:t>
+        <w:t xml:space="preserve">Sports</w:t>
       </w:r>
     </w:p>
     <w:p>
@@ -460,7 +494,7 @@
         </w:numPr>
       </w:pPr>
       <w:r>
-        <w:t xml:space="preserve">Video shooting, vertical and horizontal formats</w:t>
+        <w:t xml:space="preserve">Moscow ice hockey champion</w:t>
       </w:r>
     </w:p>
     <w:p>
@@ -472,7 +506,7 @@
         </w:numPr>
       </w:pPr>
       <w:r>
-        <w:t xml:space="preserve">Editing and post-production in DaVinci Resolve</w:t>
+        <w:t xml:space="preserve">Bronze medalist, Moscow Region ice hockey championship</w:t>
       </w:r>
     </w:p>
     <w:p>
@@ -484,7 +518,7 @@
         </w:numPr>
       </w:pPr>
       <w:r>
-        <w:t xml:space="preserve">Color grading</w:t>
+        <w:t xml:space="preserve">Moscow Marathon finisher</w:t>
       </w:r>
     </w:p>
     <w:p>
@@ -496,108 +530,29 @@
         </w:numPr>
       </w:pPr>
       <w:r>
-        <w:t xml:space="preserve">Sound</w:t>
-      </w:r>
-    </w:p>
-    <w:p>
-      <w:pPr>
-        <w:pStyle w:val="Compact"/>
-        <w:numPr>
-          <w:ilvl w:val="0"/>
-          <w:numId w:val="1006"/>
-        </w:numPr>
-      </w:pPr>
-      <w:r>
-        <w:t xml:space="preserve">Masking and chroma key</w:t>
-      </w:r>
-    </w:p>
-    <w:p>
-      <w:pPr>
-        <w:pStyle w:val="Compact"/>
-        <w:numPr>
-          <w:ilvl w:val="0"/>
-          <w:numId w:val="1006"/>
-        </w:numPr>
-      </w:pPr>
-      <w:r>
-        <w:t xml:space="preserve">Lighting and gimbal work</w:t>
-      </w:r>
-    </w:p>
-    <w:bookmarkEnd w:id="16"/>
-    <w:bookmarkStart w:id="17" w:name="gear"/>
+        <w:t xml:space="preserve">13 years of ice hockey</w:t>
+      </w:r>
+    </w:p>
+    <w:p>
+      <w:pPr>
+        <w:pStyle w:val="FirstParagraph"/>
+      </w:pPr>
+      <w:r>
+        <w:rPr>
+          <w:i/>
+          <w:iCs/>
+        </w:rPr>
+        <w:t xml:space="preserve">Years of competitive sport have built discipline, a team mindset, resilience under pressure and a systematic, results-driven approach.</w:t>
+      </w:r>
+    </w:p>
+    <w:bookmarkEnd w:id="18"/>
+    <w:bookmarkStart w:id="19" w:name="qualities"/>
     <w:p>
       <w:pPr>
         <w:pStyle w:val="Heading2"/>
       </w:pPr>
       <w:r>
-        <w:t xml:space="preserve">Gear</w:t>
-      </w:r>
-    </w:p>
-    <w:p>
-      <w:pPr>
-        <w:pStyle w:val="DefinitionTerm"/>
-      </w:pPr>
-      <w:r>
-        <w:t xml:space="preserve">Camera</w:t>
-      </w:r>
-    </w:p>
-    <w:p>
-      <w:pPr>
-        <w:pStyle w:val="Definition"/>
-      </w:pPr>
-      <w:r>
-        <w:t xml:space="preserve">Sony ZV-E10 II</w:t>
-      </w:r>
-    </w:p>
-    <w:p>
-      <w:pPr>
-        <w:pStyle w:val="DefinitionTerm"/>
-      </w:pPr>
-      <w:r>
-        <w:t xml:space="preserve">Lens</w:t>
-      </w:r>
-    </w:p>
-    <w:p>
-      <w:pPr>
-        <w:pStyle w:val="Definition"/>
-      </w:pPr>
-      <w:r>
-        <w:t xml:space="preserve">Sigma 18–50mm f/2.8</w:t>
-      </w:r>
-    </w:p>
-    <w:p>
-      <w:pPr>
-        <w:pStyle w:val="DefinitionTerm"/>
-      </w:pPr>
-      <w:r>
-        <w:t xml:space="preserve">Gimbal</w:t>
-      </w:r>
-    </w:p>
-    <w:p>
-      <w:pPr>
-        <w:pStyle w:val="Definition"/>
-      </w:pPr>
-      <w:r>
-        <w:t xml:space="preserve">DJI RS 4 Mini</w:t>
-      </w:r>
-    </w:p>
-    <w:bookmarkEnd w:id="17"/>
-    <w:bookmarkStart w:id="19" w:name="education"/>
-    <w:p>
-      <w:pPr>
-        <w:pStyle w:val="Heading2"/>
-      </w:pPr>
-      <w:r>
-        <w:t xml:space="preserve">Education</w:t>
-      </w:r>
-    </w:p>
-    <w:bookmarkStart w:id="18" w:name="Xa9fb5b3ae619b275378b0b935d4cd8c4f2941b5"/>
-    <w:p>
-      <w:pPr>
-        <w:pStyle w:val="Heading3"/>
-      </w:pPr>
-      <w:r>
-        <w:t xml:space="preserve">Plekhanov Russian University of Economics</w:t>
+        <w:t xml:space="preserve">Qualities</w:t>
       </w:r>
     </w:p>
     <w:p>
@@ -605,112 +560,11 @@
         <w:pStyle w:val="FirstParagraph"/>
       </w:pPr>
       <w:r>
-        <w:t xml:space="preserve">2025 — present</w:t>
-      </w:r>
-    </w:p>
-    <w:p>
-      <w:pPr>
-        <w:pStyle w:val="BodyText"/>
-      </w:pPr>
-      <w:r>
-        <w:t xml:space="preserve">Media Communications program, Film and Media Production track, year 2.</w:t>
-      </w:r>
-    </w:p>
-    <w:p>
-      <w:pPr>
-        <w:pStyle w:val="BodyText"/>
-      </w:pPr>
-      <w:r>
-        <w:t xml:space="preserve">On my own, I study film theory, cinematography, lighting and editing.</w:t>
-      </w:r>
-    </w:p>
-    <w:bookmarkEnd w:id="18"/>
+        <w:t xml:space="preserve">Strong communicator · proactive · responsible · disciplined · calm under pressure · team player who sees projects through to completion</w:t>
+      </w:r>
+    </w:p>
     <w:bookmarkEnd w:id="19"/>
-    <w:bookmarkStart w:id="20" w:name="sports"/>
-    <w:p>
-      <w:pPr>
-        <w:pStyle w:val="Heading2"/>
-      </w:pPr>
-      <w:r>
-        <w:t xml:space="preserve">Sports</w:t>
-      </w:r>
-    </w:p>
-    <w:p>
-      <w:pPr>
-        <w:pStyle w:val="Compact"/>
-        <w:numPr>
-          <w:ilvl w:val="0"/>
-          <w:numId w:val="1007"/>
-        </w:numPr>
-      </w:pPr>
-      <w:r>
-        <w:t xml:space="preserve">Moscow Hockey Championship, 1st place (2024)</w:t>
-      </w:r>
-    </w:p>
-    <w:p>
-      <w:pPr>
-        <w:pStyle w:val="Compact"/>
-        <w:numPr>
-          <w:ilvl w:val="0"/>
-          <w:numId w:val="1007"/>
-        </w:numPr>
-      </w:pPr>
-      <w:r>
-        <w:t xml:space="preserve">Moscow Oblast Hockey Championship, 3rd place (2025)</w:t>
-      </w:r>
-    </w:p>
-    <w:p>
-      <w:pPr>
-        <w:pStyle w:val="Compact"/>
-        <w:numPr>
-          <w:ilvl w:val="0"/>
-          <w:numId w:val="1007"/>
-        </w:numPr>
-      </w:pPr>
-      <w:r>
-        <w:t xml:space="preserve">Moscow Marathon finisher, 42.2 km (2026)</w:t>
-      </w:r>
-    </w:p>
-    <w:p>
-      <w:pPr>
-        <w:pStyle w:val="Compact"/>
-        <w:numPr>
-          <w:ilvl w:val="0"/>
-          <w:numId w:val="1007"/>
-        </w:numPr>
-      </w:pPr>
-      <w:r>
-        <w:t xml:space="preserve">13 years of hockey, since age 6</w:t>
-      </w:r>
-    </w:p>
-    <w:p>
-      <w:pPr>
-        <w:pStyle w:val="FirstParagraph"/>
-      </w:pPr>
-      <w:r>
-        <w:t xml:space="preserve">Sport taught me discipline, teamwork and how to keep going under pressure until the job is done.</w:t>
-      </w:r>
-    </w:p>
     <w:bookmarkEnd w:id="20"/>
-    <w:bookmarkStart w:id="21" w:name="personal-qualities"/>
-    <w:p>
-      <w:pPr>
-        <w:pStyle w:val="Heading2"/>
-      </w:pPr>
-      <w:r>
-        <w:t xml:space="preserve">Personal qualities</w:t>
-      </w:r>
-    </w:p>
-    <w:p>
-      <w:pPr>
-        <w:pStyle w:val="FirstParagraph"/>
-      </w:pPr>
-      <w:r>
-        <w:t xml:space="preserve">Sociable, proactive, responsible, calm under pressure, a team player who finishes what he starts.</w:t>
-      </w:r>
-    </w:p>
-    <w:bookmarkEnd w:id="21"/>
-    <w:bookmarkEnd w:id="22"/>
     <w:sectPr>
       <w:footnotePr>
         <w:numRestart w:val="eachSect"/>
@@ -924,6 +778,91 @@
       </w:rPr>
     </w:lvl>
   </w:abstractNum>
+  <w:abstractNum w:abstractNumId="99411">
+    <w:nsid w:val="00A99411"/>
+    <w:multiLevelType w:val="multilevel"/>
+    <w:lvl w:ilvl="0">
+      <w:start w:val="1"/>
+      <w:numFmt w:val="decimal"/>
+      <w:lvlText w:val="%1."/>
+      <w:lvlJc w:val="left"/>
+      <w:pPr>
+        <w:ind w:left="720" w:hanging="360"/>
+      </w:pPr>
+    </w:lvl>
+    <w:lvl w:ilvl="1">
+      <w:start w:val="1"/>
+      <w:numFmt w:val="decimal"/>
+      <w:lvlText w:val="%2."/>
+      <w:lvlJc w:val="left"/>
+      <w:pPr>
+        <w:ind w:left="1440" w:hanging="360"/>
+      </w:pPr>
+    </w:lvl>
+    <w:lvl w:ilvl="2">
+      <w:start w:val="1"/>
+      <w:numFmt w:val="decimal"/>
+      <w:lvlText w:val="%3."/>
+      <w:lvlJc w:val="left"/>
+      <w:pPr>
+        <w:ind w:left="2160" w:hanging="360"/>
+      </w:pPr>
+    </w:lvl>
+    <w:lvl w:ilvl="3">
+      <w:start w:val="1"/>
+      <w:numFmt w:val="decimal"/>
+      <w:lvlText w:val="%4."/>
+      <w:lvlJc w:val="left"/>
+      <w:pPr>
+        <w:ind w:left="2880" w:hanging="360"/>
+      </w:pPr>
+    </w:lvl>
+    <w:lvl w:ilvl="4">
+      <w:start w:val="1"/>
+      <w:numFmt w:val="decimal"/>
+      <w:lvlText w:val="%5."/>
+      <w:lvlJc w:val="left"/>
+      <w:pPr>
+        <w:ind w:left="3600" w:hanging="360"/>
+      </w:pPr>
+    </w:lvl>
+    <w:lvl w:ilvl="5">
+      <w:start w:val="1"/>
+      <w:numFmt w:val="decimal"/>
+      <w:lvlText w:val="%6."/>
+      <w:lvlJc w:val="left"/>
+      <w:pPr>
+        <w:ind w:left="4320" w:hanging="360"/>
+      </w:pPr>
+    </w:lvl>
+    <w:lvl w:ilvl="6">
+      <w:start w:val="1"/>
+      <w:numFmt w:val="decimal"/>
+      <w:lvlText w:val="%7."/>
+      <w:lvlJc w:val="left"/>
+      <w:pPr>
+        <w:ind w:left="5040" w:hanging="360"/>
+      </w:pPr>
+    </w:lvl>
+    <w:lvl w:ilvl="7">
+      <w:start w:val="1"/>
+      <w:numFmt w:val="decimal"/>
+      <w:lvlText w:val="%8."/>
+      <w:lvlJc w:val="left"/>
+      <w:pPr>
+        <w:ind w:left="5760" w:hanging="360"/>
+      </w:pPr>
+    </w:lvl>
+    <w:lvl w:ilvl="8">
+      <w:start w:val="1"/>
+      <w:numFmt w:val="decimal"/>
+      <w:lvlText w:val="%9."/>
+      <w:lvlJc w:val="left"/>
+      <w:pPr>
+        <w:ind w:left="6480" w:hanging="360"/>
+      </w:pPr>
+    </w:lvl>
+  </w:abstractNum>
   <w:num w:numId="1000">
     <w:abstractNumId w:val="990"/>
   </w:num>
@@ -931,7 +870,34 @@
     <w:abstractNumId w:val="991"/>
   </w:num>
   <w:num w:numId="1002">
-    <w:abstractNumId w:val="991"/>
+    <w:abstractNumId w:val="99411"/>
+    <w:lvlOverride w:ilvl="0">
+      <w:startOverride w:val="1"/>
+    </w:lvlOverride>
+    <w:lvlOverride w:ilvl="1">
+      <w:startOverride w:val="1"/>
+    </w:lvlOverride>
+    <w:lvlOverride w:ilvl="2">
+      <w:startOverride w:val="1"/>
+    </w:lvlOverride>
+    <w:lvlOverride w:ilvl="3">
+      <w:startOverride w:val="1"/>
+    </w:lvlOverride>
+    <w:lvlOverride w:ilvl="4">
+      <w:startOverride w:val="1"/>
+    </w:lvlOverride>
+    <w:lvlOverride w:ilvl="5">
+      <w:startOverride w:val="1"/>
+    </w:lvlOverride>
+    <w:lvlOverride w:ilvl="6">
+      <w:startOverride w:val="1"/>
+    </w:lvlOverride>
+    <w:lvlOverride w:ilvl="7">
+      <w:startOverride w:val="1"/>
+    </w:lvlOverride>
+    <w:lvlOverride w:ilvl="8">
+      <w:startOverride w:val="1"/>
+    </w:lvlOverride>
   </w:num>
   <w:num w:numId="1003">
     <w:abstractNumId w:val="991"/>
@@ -943,9 +909,6 @@
     <w:abstractNumId w:val="991"/>
   </w:num>
   <w:num w:numId="1006">
-    <w:abstractNumId w:val="991"/>
-  </w:num>
-  <w:num w:numId="1007">
     <w:abstractNumId w:val="991"/>
   </w:num>
 </w:numbering>

</xml_diff>